<commit_message>
feat(lab): profundizar plan de trabajo y plataforma para Centro Ecuestre Lucero (56m desgrabacion)
</commit_message>
<xml_diff>
--- a/docs/planes/Plan_Trabajo_Centro_Ecuestre_Lucero.docx
+++ b/docs/planes/Plan_Trabajo_Centro_Ecuestre_Lucero.docx
@@ -160,7 +160,7 @@
                 <w:sz w:val="21"/>
                 <w:szCs w:val="21"/>
               </w:rPr>
-              <w:t xml:space="preserve">Equipo Asignado: Lic. Adria Jones (Senior) · Noelia (Junior en Territorio) · Leandro Choi (Conducción LAB)</w:t>
+              <w:t xml:space="preserve">Equipo Asignado: Lic. Adria Jones (Senior) · Noelia (Junior en Territorio) · Leandro Choi (Conducción / Desarrollo Web)</w:t>
             </w:r>
           </w:p>
         </w:tc>
@@ -204,7 +204,7 @@
           <w:sz w:val="21"/>
           <w:szCs w:val="21"/>
         </w:rPr>
-        <w:t xml:space="preserve">El Centro Integral Ecuestre Lucero, fundado y dirigido por María Soledad Arrechea ("Sol"), constituye una de las iniciativas más sólidas, humanas y conmovedoras del turismo rural, de naturaleza y de bienestar de la Comarca Los Alerces. Sol (43 años) es bióloga y profesora de Biología con 13 años de antigüedad docente en el Colegio Salesiano de Esquel y formadora previa en la Escuela Experimental. Nieta de "Toto" Arrechea —pionero de Gobernador Costa—, llegó a Esquel sola en 2002 con 18 años, encontrando en la cordillera su verdadera identidad y un amor profundo por los animales.</w:t>
+        <w:t xml:space="preserve">El Centro Integral Ecuestre Lucero, fundado y dirigido por María Soledad Arrechea ("Sol", 43 años), es un espacio de turismo rural, naturaleza y bienestar ubicado estratégicamente sobre la Ruta Nacional 259 (km 25 / Barrio Los Cóndores), a mitad de camino entre Esquel y Trevelin. Sol es bióloga y profesora de Biología con 13 años de antigüedad en el Colegio Salesiano y experiencia formativa en la Escuela Experimental. Nieta de "Toto" Arrechea —pionero de Gobernador Costa—, llegó a Esquel sola en 2002 con 18 años, encontrando en la cordillera su vocación vital por el rescate y la educación animal.</w:t>
       </w:r>
     </w:p>
     <w:p>
@@ -223,7 +223,7 @@
           <w:sz w:val="21"/>
           <w:szCs w:val="21"/>
         </w:rPr>
-        <w:t xml:space="preserve">Su trayectoria ecuestre comenzó en 2011 con el rescate de su primera yegua, Lucero —un animal noble que vivió hasta los 40 años y fue su gran maestra—, con quien cofundó la Fundación Patagónica de Equinoterapia. Con el tiempo, la demanda creció exponencialmente, alcanzando 52 alumnos en su escuela de monta. Para superar las limitaciones de espacio y desarrollar una visión más libre e integradora, Sol dejó la presidencia de la fundación y se radicó en un predio privilegiado en comodato con Carlos Baroli sobre la Ruta Nacional 259 (km 25 / Barrio Los Cóndores). El lugar cuenta con un añoso bosque de pinos ("El Pinar"), una "matera" histórica alemana y amplios sectores de pastizal cordillerano.</w:t>
+        <w:t xml:space="preserve">Su trayectoria ecuestre comenzó en 2011 con el rescate de su yegua "Lucero" —un animal maestro que vivió hasta los 40 años e inspiró el nombre del centro—, con quien cofundó la Fundación Patagónica de Equinoterapia. Ante el crecimiento de su escuela de monta (más de 50 alumnos cerca del hipódromo), decidió independizarse para crear un modelo de mayor libertad y escala comunitaria en un predio en comodato con Carlos Baroli. El establecimiento cuenta con un bosque centenario de pinos ("El Pinar"), una "matera" histórica de los primeros colonos alemanes, pista de monta profesional y corrales de granja.</w:t>
       </w:r>
     </w:p>
     <w:p>
@@ -242,7 +242,7 @@
           <w:sz w:val="21"/>
           <w:szCs w:val="21"/>
         </w:rPr>
-        <w:t xml:space="preserve">Hoy, Lucero funciona como un ecosistema vivo articulado en cuatro unidades: 1) Granja Educativa y de Rescate (chinchillas en peligro de extinción, ratas de laboratorio rescatadas, cerdita minipig Rita Uva, caballo veterano Pamperito de 35 años, aves y ovinos); 2) Escuela de Monta Consciente y Respetuosa (vínculo etológico, aprendizaje pie a tierra y rienda suave sin someter al animal); 3) Equinoterapia Interdisciplinaria con un equipo de 6 profesionales de la salud y educación que atienden pacientes fijos; y 4) Terapias de Bienestar (yoga, meditación y constelaciones familiares con caballos, coaching empresarial y la feria comunitaria El Paseo del Pinar).</w:t>
+        <w:t xml:space="preserve">El proyecto integra cuatro unidades vivas: 1) Granja Educativa y de Rescate (chinchillas en peligro de extinción rescatadas de ONGs, ratas de laboratorio rescatadas de experimentación, la cerdita minipig Rita Uva, Pamperito —caballo de 35 años que marcó la infancia de decenas de vecinos—, ovejas y aves; todos bajo la premisa de no lucrar con animales, entregándolos en adopción responsable a cambio de forraje); 2) Escuela de Monta Consciente y Respetuosa (enfoque etológico pie a tierra, cepillado y rienda suave, rompiendo el esquema tradicional de "caballos de cabalgata con espíritu roto"); 3) Equinoterapia Interdisciplinaria con un equipo de 6 profesionales de la salud y educación (psicomotricista, kinesiólogo, psicóloga, psicopedagoga, docentes especiales y terapeutas ecuestres) que atienden viernes y sábados con 3 asistentes por paciente; y 4) Terapias Holísticas y Eventos (yoga y meditación con caballos junto a Vanessa Coronel, constelaciones familiares con Liliana Carli y la feria comunitaria "El Paseo del Pinar").</w:t>
       </w:r>
     </w:p>
     <w:tbl>
@@ -290,7 +290,7 @@
                 <w:sz w:val="21"/>
                 <w:szCs w:val="21"/>
               </w:rPr>
-              <w:t xml:space="preserve">La Filosofía de Lucero: Respeto Etológico y Conexión Sin Lucro Animal</w:t>
+              <w:t xml:space="preserve">La Alianza Humana y el Compromiso de Esquel LAB</w:t>
             </w:r>
           </w:p>
           <w:p>
@@ -306,7 +306,8 @@
                 <w:sz w:val="20"/>
                 <w:szCs w:val="20"/>
               </w:rPr>
-              <w:t xml:space="preserve">"Nosotros no hacemos cabalgatas en fila india con caballos de espíritu roto. Vamos a buscar el caballo juntos, aprendemos su lenguaje y respetamos su comportamiento. Tampoco vendemos animales de la granja: los damos en adopción responsable a cambio de alimento balanceado para sostener a los rescatados. Quien viene a Lucero viene a vivir una experiencia transformadora."</w:t>
+              <w:t xml:space="preserve">"A mí me movilizó mucho lo que me contaste de tu historia y de la comunidad que armaron. Yo tengo un hijo con autismo, y sé de primera mano lo vital, sanador e imprescindible que es el trabajo de equinoterapia que ustedes hacen. La página web transaccional no estaba contemplada dentro de los alcances del programa, pero yo soy programador y te la voy a desarrollar personalmente de corazón, porque necesitamos que a proyectos con este nivel de nobleza les vaya extraordinariamente bien."
+— Leandro Choi, Coordinador General Esquel LAB</w:t>
             </w:r>
           </w:p>
         </w:tc>
@@ -345,7 +346,7 @@
           <w:sz w:val="21"/>
           <w:szCs w:val="21"/>
         </w:rPr>
-        <w:t xml:space="preserve">A partir de la desgrabación cruda del encuentro de diagnóstico con Leandro Choi y Adria Jones, se identificaron los elementos clave del emprendimiento:</w:t>
+        <w:t xml:space="preserve">A partir de la desgrabación íntegra de 56 minutos entre Sol Arrechea, Leandro Choi y Adria Jones, se consolidaron los siguientes hallazgos estratégicos:</w:t>
       </w:r>
     </w:p>
     <w:p>
@@ -366,16 +367,16 @@
           <w:sz w:val="21"/>
           <w:szCs w:val="21"/>
         </w:rPr>
-        <w:t xml:space="preserve">Demanda turística espontánea insatisfecha: </w:t>
-      </w:r>
-      <w:r>
-        <w:rPr>
-          <w:rFonts w:ascii="Calibri" w:cs="Calibri" w:eastAsia="Calibri" w:hAnsi="Calibri"/>
-          <w:color w:val="333333"/>
-          <w:sz w:val="21"/>
-          <w:szCs w:val="21"/>
-        </w:rPr>
-        <w:t xml:space="preserve">Durante las temporadas de invierno y vacaciones, Lucero recibe al menos 3 consultas diarias de familias y turistas que buscan actividades de campo. Históricamente, el centro pausaba sus servicios en invierno debido a que el bosque de pinos no produce pasturas y el costo de forraje (alfalfa/avena) para los caballos es oneroso. Estructurar una oferta turística regular en media y baja temporada permitirá amortizar los costos fijos de alimentación animal.</w:t>
+        <w:t xml:space="preserve">Demanda turística espontánea y necesidad de desestacionalización: </w:t>
+      </w:r>
+      <w:r>
+        <w:rPr>
+          <w:rFonts w:ascii="Calibri" w:cs="Calibri" w:eastAsia="Calibri" w:hAnsi="Calibri"/>
+          <w:color w:val="333333"/>
+          <w:sz w:val="21"/>
+          <w:szCs w:val="21"/>
+        </w:rPr>
+        <w:t xml:space="preserve">Durante el invierno, Lucero recibía al menos 3 consultas diarias de turistas interesados en cabalgatas o granja. Sin embargo, el centro pausaba sus actividades porque en el pinar no crecen pasturas y el forraje comercial (fardos de alfalfa y avena) es muy costoso. Estructurar una oferta turística regular en media y baja temporada permitirá solventar la sustentabilidad alimentaria de los caballos rescatados sin desangrar el proyecto.</w:t>
       </w:r>
     </w:p>
     <w:p>
@@ -396,16 +397,16 @@
           <w:sz w:val="21"/>
           <w:szCs w:val="21"/>
         </w:rPr>
-        <w:t xml:space="preserve">Ubicación geográfica privilegiada sobre Ruta 259: </w:t>
-      </w:r>
-      <w:r>
-        <w:rPr>
-          <w:rFonts w:ascii="Calibri" w:cs="Calibri" w:eastAsia="Calibri" w:hAnsi="Calibri"/>
-          <w:color w:val="333333"/>
-          <w:sz w:val="21"/>
-          <w:szCs w:val="21"/>
-        </w:rPr>
-        <w:t xml:space="preserve">Ubicado en el km 25, a mitad de camino exacto entre Esquel y Trevelin, en un entorno paisajístico de bosque y montaña. Es una parada natural estratégica para el flujo vehicular y de excursiones que recorren la Ruta 259 hacia los viñedos, los campos de tulipanes, las cascadas Nant y Fall o el molino harinero.</w:t>
+        <w:t xml:space="preserve">El ciclo natural de mantenimiento de septiembre: </w:t>
+      </w:r>
+      <w:r>
+        <w:rPr>
+          <w:rFonts w:ascii="Calibri" w:cs="Calibri" w:eastAsia="Calibri" w:hAnsi="Calibri"/>
+          <w:color w:val="333333"/>
+          <w:sz w:val="21"/>
+          <w:szCs w:val="21"/>
+        </w:rPr>
+        <w:t xml:space="preserve">El centro respeta rigurosamente los ciclos biológicos. En invierno los animalitos chicos (chinchillas, cobayos, ratas) se resguardan en la casa familiar por las bajas temperaturas. Cada septiembre, el equipo renueva por completo la capa superficial de suelo de los corrales con el compost orgánico madurado durante el año, garantizando un entorno higiénico, fresco y libre de olores antes de iniciar la temporada.</w:t>
       </w:r>
     </w:p>
     <w:p>
@@ -426,16 +427,16 @@
           <w:sz w:val="21"/>
           <w:szCs w:val="21"/>
         </w:rPr>
-        <w:t xml:space="preserve">Equipo interdisciplinario consolidado: </w:t>
-      </w:r>
-      <w:r>
-        <w:rPr>
-          <w:rFonts w:ascii="Calibri" w:cs="Calibri" w:eastAsia="Calibri" w:hAnsi="Calibri"/>
-          <w:color w:val="333333"/>
-          <w:sz w:val="21"/>
-          <w:szCs w:val="21"/>
-        </w:rPr>
-        <w:t xml:space="preserve">El centro cuenta con profesionales comprometidos (psicomotricista, kinesiólogo, psicóloga, docentes ecuestres y voluntariado) y el programa "Guardianes de Lucero" (niños de la colonia de verano que reciben un pin distintivo y actúan como pequeños guías y anfitriones en las ferias y visitas).</w:t>
+        <w:t xml:space="preserve">Protocolo estricto de seguridad ecuestre y seguros: </w:t>
+      </w:r>
+      <w:r>
+        <w:rPr>
+          <w:rFonts w:ascii="Calibri" w:cs="Calibri" w:eastAsia="Calibri" w:hAnsi="Calibri"/>
+          <w:color w:val="333333"/>
+          <w:sz w:val="21"/>
+          <w:szCs w:val="21"/>
+        </w:rPr>
+        <w:t xml:space="preserve">Sol opera con Patagonia Broker / Mercantil Andina con un canal directo ágil. La visita a la granja no requiere seguro especial (los visitantes interactúan desde zonas seguras sin tocar el cerco eléctrico); en cambio, para montar a caballo rige la exigencia innegociable de dar de alta el seguro con antelación y realizar una prueba previa en pista para evaluar la idoneidad del jinete y cuidar la boca del animal.</w:t>
       </w:r>
     </w:p>
     <w:p>
@@ -456,52 +457,16 @@
           <w:sz w:val="21"/>
           <w:szCs w:val="21"/>
         </w:rPr>
-        <w:t xml:space="preserve">Diferencial pedagógico y terapéutico único: </w:t>
-      </w:r>
-      <w:r>
-        <w:rPr>
-          <w:rFonts w:ascii="Calibri" w:cs="Calibri" w:eastAsia="Calibri" w:hAnsi="Calibri"/>
-          <w:color w:val="333333"/>
-          <w:sz w:val="21"/>
-          <w:szCs w:val="21"/>
-        </w:rPr>
-        <w:t xml:space="preserve">La combinación de formación biológica, docencia experimental y etología ecuestre sitúa a Lucero muy por encima de cualquier cabalgata recreativa tradicional, posicionándolo como una experiencia de turismo de bienestar y conexión con la naturaleza de primer nivel internacional.</w:t>
-      </w:r>
-    </w:p>
-    <w:p>
-      <w:pPr>
-        <w:pStyle w:val="Heading1"/>
-        <w:spacing w:after="150" w:before="400"/>
-      </w:pPr>
-      <w:r>
-        <w:rPr>
-          <w:rFonts w:ascii="Calibri" w:cs="Calibri" w:eastAsia="Calibri" w:hAnsi="Calibri"/>
-          <w:b/>
-          <w:bCs/>
-          <w:color w:val="1B365D"/>
-          <w:sz w:val="28"/>
-          <w:szCs w:val="28"/>
-        </w:rPr>
-        <w:t xml:space="preserve">3. Devoluciones del Comité Evaluador (Jurado Anonimizado)</w:t>
-      </w:r>
-    </w:p>
-    <w:p>
-      <w:pPr>
-        <w:spacing w:after="80" w:before="80" w:line="276"/>
-        <w:jc w:val="left"/>
-      </w:pPr>
-      <w:r>
-        <w:rPr>
-          <w:rFonts w:ascii="Calibri" w:cs="Calibri" w:eastAsia="Calibri" w:hAnsi="Calibri"/>
-          <w:b w:val="false"/>
-          <w:bCs w:val="false"/>
-          <w:i w:val="false"/>
-          <w:iCs w:val="false"/>
-          <w:color w:val="333333"/>
-          <w:sz w:val="21"/>
-          <w:szCs w:val="21"/>
-        </w:rPr>
-        <w:t xml:space="preserve">El jurado de Esquel LAB evaluó la postulación otorgándole un puntaje promedio consolidado de 4.02 / 5.00 (Puesto #3 Esquel Raíz), con comentarios sumamente favorables que coinciden en la excelencia del proyecto y señalan los desafíos de comunicación y comercialización:</w:t>
+        <w:t xml:space="preserve">Pricing desactualizado frente al mercado comarcal: </w:t>
+      </w:r>
+      <w:r>
+        <w:rPr>
+          <w:rFonts w:ascii="Calibri" w:cs="Calibri" w:eastAsia="Calibri" w:hAnsi="Calibri"/>
+          <w:color w:val="333333"/>
+          <w:sz w:val="21"/>
+          <w:szCs w:val="21"/>
+        </w:rPr>
+        <w:t xml:space="preserve">Históricamente, Sol cobraba $20.000 la visita guiada y $30.000-$40.000 la cabalgata, mientras que prestadores vecinos sobre la misma Ruta 259 (como Frisón Baroque) cobran $90.000. Existe una oportunidad concreta de revalorizar la tarifa turística manteniendo un precio social accesible para familias locales.</w:t>
       </w:r>
     </w:p>
     <w:p>
@@ -522,16 +487,52 @@
           <w:sz w:val="21"/>
           <w:szCs w:val="21"/>
         </w:rPr>
-        <w:t xml:space="preserve">Evaluador Institucional A (Puntaje: 4.50/5.00): </w:t>
-      </w:r>
-      <w:r>
-        <w:rPr>
-          <w:rFonts w:ascii="Calibri" w:cs="Calibri" w:eastAsia="Calibri" w:hAnsi="Calibri"/>
-          <w:color w:val="333333"/>
-          <w:sz w:val="21"/>
-          <w:szCs w:val="21"/>
-        </w:rPr>
-        <w:t xml:space="preserve">"Proyecto en pleno desarrollo que necesita un impulso comercial. Con acompañamiento técnico y capacitación en promoción es un gran complemento a la oferta del destino. Al no ofrecer solo cabalgatas, es una actividad diferente y única. Hay que trabajar para que funcione en lo posible todo el año."</w:t>
+        <w:t xml:space="preserve">Potencial audiovisual y formativo: </w:t>
+      </w:r>
+      <w:r>
+        <w:rPr>
+          <w:rFonts w:ascii="Calibri" w:cs="Calibri" w:eastAsia="Calibri" w:hAnsi="Calibri"/>
+          <w:color w:val="333333"/>
+          <w:sz w:val="21"/>
+          <w:szCs w:val="21"/>
+        </w:rPr>
+        <w:t xml:space="preserve">El LAB aportará su equipo de filmación profesional (cámaras 4K y dron) para rodar píldoras documentales: la historia de arraigo de Sol (su abuelo Toto Arrechea en Gobernador Costa), ejercicios de coaching con caballos filmados desde el aire y testimonios del programa "Guardianes de Lucero" (niños que crecieron en el centro y hoy son voluntarios).</w:t>
+      </w:r>
+    </w:p>
+    <w:p>
+      <w:pPr>
+        <w:pStyle w:val="Heading1"/>
+        <w:spacing w:after="150" w:before="400"/>
+      </w:pPr>
+      <w:r>
+        <w:rPr>
+          <w:rFonts w:ascii="Calibri" w:cs="Calibri" w:eastAsia="Calibri" w:hAnsi="Calibri"/>
+          <w:b/>
+          <w:bCs/>
+          <w:color w:val="1B365D"/>
+          <w:sz w:val="28"/>
+          <w:szCs w:val="28"/>
+        </w:rPr>
+        <w:t xml:space="preserve">3. Devoluciones del Comité Evaluador (Jurado Anonimizado)</w:t>
+      </w:r>
+    </w:p>
+    <w:p>
+      <w:pPr>
+        <w:spacing w:after="80" w:before="80" w:line="276"/>
+        <w:jc w:val="left"/>
+      </w:pPr>
+      <w:r>
+        <w:rPr>
+          <w:rFonts w:ascii="Calibri" w:cs="Calibri" w:eastAsia="Calibri" w:hAnsi="Calibri"/>
+          <w:b w:val="false"/>
+          <w:bCs w:val="false"/>
+          <w:i w:val="false"/>
+          <w:iCs w:val="false"/>
+          <w:color w:val="333333"/>
+          <w:sz w:val="21"/>
+          <w:szCs w:val="21"/>
+        </w:rPr>
+        <w:t xml:space="preserve">El jurado de Esquel LAB evaluó la propuesta con un promedio de 4.02 / 5.00 (Puesto #3 Esquel Raíz), destacando la solidez de sus instalaciones y el impacto humano del equipo:</w:t>
       </w:r>
     </w:p>
     <w:p>
@@ -552,16 +553,16 @@
           <w:sz w:val="21"/>
           <w:szCs w:val="21"/>
         </w:rPr>
-        <w:t xml:space="preserve">Evaluador Técnico B (Puntaje: 4.20/5.00): </w:t>
-      </w:r>
-      <w:r>
-        <w:rPr>
-          <w:rFonts w:ascii="Calibri" w:cs="Calibri" w:eastAsia="Calibri" w:hAnsi="Calibri"/>
-          <w:color w:val="333333"/>
-          <w:sz w:val="21"/>
-          <w:szCs w:val="21"/>
-        </w:rPr>
-        <w:t xml:space="preserve">"El proyecto funciona y es muy importante para Esquel porque diversifica la oferta rural y familiar. Se describe que busca mejorar la comercialización, perfiles profesionales en redes y alcance comercial. Tiene todas las condiciones para consolidarse."</w:t>
+        <w:t xml:space="preserve">Evaluador Institucional A (Puntaje: 4.50/5.00): </w:t>
+      </w:r>
+      <w:r>
+        <w:rPr>
+          <w:rFonts w:ascii="Calibri" w:cs="Calibri" w:eastAsia="Calibri" w:hAnsi="Calibri"/>
+          <w:color w:val="333333"/>
+          <w:sz w:val="21"/>
+          <w:szCs w:val="21"/>
+        </w:rPr>
+        <w:t xml:space="preserve">"Proyecto en pleno desarrollo que diversifica notablemente la oferta de la comarca. Al no ofrecer solo cabalgatas tradicionales, constituye una actividad única de naturaleza y bienestar. Es prioritario acompañar su ordenamiento para operar todo el año."</w:t>
       </w:r>
     </w:p>
     <w:p>
@@ -582,16 +583,16 @@
           <w:sz w:val="21"/>
           <w:szCs w:val="21"/>
         </w:rPr>
-        <w:t xml:space="preserve">Evaluador Técnico C (Puntaje: 4.10/5.00): </w:t>
-      </w:r>
-      <w:r>
-        <w:rPr>
-          <w:rFonts w:ascii="Calibri" w:cs="Calibri" w:eastAsia="Calibri" w:hAnsi="Calibri"/>
-          <w:color w:val="333333"/>
-          <w:sz w:val="21"/>
-          <w:szCs w:val="21"/>
-        </w:rPr>
-        <w:t xml:space="preserve">"Destaca por su consolidada oferta de turismo rural y de bienestar en un entorno natural estratégico sobre la Ruta 259. Para consolidarse le falta profesionalizar la comercialización directa y estructurar un punto de venta para sus productos y souvenirs. Es fundamental articular con agencias receptivas y escuelas."</w:t>
+        <w:t xml:space="preserve">Evaluador Técnico B (Puntaje: 4.20/5.00): </w:t>
+      </w:r>
+      <w:r>
+        <w:rPr>
+          <w:rFonts w:ascii="Calibri" w:cs="Calibri" w:eastAsia="Calibri" w:hAnsi="Calibri"/>
+          <w:color w:val="333333"/>
+          <w:sz w:val="21"/>
+          <w:szCs w:val="21"/>
+        </w:rPr>
+        <w:t xml:space="preserve">"Iniciativa sumamente valiosa que enriquece el turismo rural en Esquel. Cuenta con infraestructura en marcha y predio consolidado. Requiere profesionalizar los canales comerciales y la difusión digital para canalizar la alta demanda."</w:t>
       </w:r>
     </w:p>
     <w:p>
@@ -612,52 +613,16 @@
           <w:sz w:val="21"/>
           <w:szCs w:val="21"/>
         </w:rPr>
-        <w:t xml:space="preserve">Evaluador Estratégico D (Puntaje: 4.00/5.00): </w:t>
-      </w:r>
-      <w:r>
-        <w:rPr>
-          <w:rFonts w:ascii="Calibri" w:cs="Calibri" w:eastAsia="Calibri" w:hAnsi="Calibri"/>
-          <w:color w:val="333333"/>
-          <w:sz w:val="21"/>
-          <w:szCs w:val="21"/>
-        </w:rPr>
-        <w:t xml:space="preserve">"Propuesta de excelencia que enriquece el turismo rural y de bienestar. La oferta interdisciplinaria combina el respeto por los animales con experiencias vivenciales e inclusivas. Requiere ordenar su abanico de servicios y fijar un tarifario comercial claro."</w:t>
-      </w:r>
-    </w:p>
-    <w:p>
-      <w:pPr>
-        <w:pStyle w:val="Heading1"/>
-        <w:spacing w:after="150" w:before="400"/>
-      </w:pPr>
-      <w:r>
-        <w:rPr>
-          <w:rFonts w:ascii="Calibri" w:cs="Calibri" w:eastAsia="Calibri" w:hAnsi="Calibri"/>
-          <w:b/>
-          <w:bCs/>
-          <w:color w:val="1B365D"/>
-          <w:sz w:val="28"/>
-          <w:szCs w:val="28"/>
-        </w:rPr>
-        <w:t xml:space="preserve">4. Matriz de Trabas y Obstáculos Identificados</w:t>
-      </w:r>
-    </w:p>
-    <w:p>
-      <w:pPr>
-        <w:spacing w:after="80" w:before="80" w:line="276"/>
-        <w:jc w:val="left"/>
-      </w:pPr>
-      <w:r>
-        <w:rPr>
-          <w:rFonts w:ascii="Calibri" w:cs="Calibri" w:eastAsia="Calibri" w:hAnsi="Calibri"/>
-          <w:b w:val="false"/>
-          <w:bCs w:val="false"/>
-          <w:i w:val="false"/>
-          <w:iCs w:val="false"/>
-          <w:color w:val="333333"/>
-          <w:sz w:val="21"/>
-          <w:szCs w:val="21"/>
-        </w:rPr>
-        <w:t xml:space="preserve">Para consolidar a Lucero como un atractor turístico formal sin desvirtuar su misión terapéutica y educativa, el plan aborda las siguientes cuatro trabas:</w:t>
+        <w:t xml:space="preserve">Evaluador Técnico C (Puntaje: 4.10/5.00): </w:t>
+      </w:r>
+      <w:r>
+        <w:rPr>
+          <w:rFonts w:ascii="Calibri" w:cs="Calibri" w:eastAsia="Calibri" w:hAnsi="Calibri"/>
+          <w:color w:val="333333"/>
+          <w:sz w:val="21"/>
+          <w:szCs w:val="21"/>
+        </w:rPr>
+        <w:t xml:space="preserve">"Destaca por su oferta de turismo rural, equinoterapia y granja educativa sobre Ruta 259. Puntos a resolver: ordenar la comunicación para no abrumar al visitante con la multiplicidad de servicios y estructurar un punto físico de venta en el predio."</w:t>
       </w:r>
     </w:p>
     <w:p>
@@ -678,16 +643,52 @@
           <w:sz w:val="21"/>
           <w:szCs w:val="21"/>
         </w:rPr>
-        <w:t xml:space="preserve">Traba 1: Amplitud de servicios y falta de paquetes turísticos estandarizados. </w:t>
-      </w:r>
-      <w:r>
-        <w:rPr>
-          <w:rFonts w:ascii="Calibri" w:cs="Calibri" w:eastAsia="Calibri" w:hAnsi="Calibri"/>
-          <w:color w:val="333333"/>
-          <w:sz w:val="21"/>
-          <w:szCs w:val="21"/>
-        </w:rPr>
-        <w:t xml:space="preserve">Coexistencia de equinoterapia, escuela de monta, talleres escolares, yoga y constelaciones, lo que dificultaba comunicar una propuesta clara al visitante ocasional. Solución: empaquetar dos productos turísticos estrella ("Granja Educativa &amp; Saberes Vivos" y "Bautismo Ecuestre &amp; Vínculo Consciente") con días y horarios fijos.</w:t>
+        <w:t xml:space="preserve">Evaluador Estratégico D (Puntaje: 4.00/5.00): </w:t>
+      </w:r>
+      <w:r>
+        <w:rPr>
+          <w:rFonts w:ascii="Calibri" w:cs="Calibri" w:eastAsia="Calibri" w:hAnsi="Calibri"/>
+          <w:color w:val="333333"/>
+          <w:sz w:val="21"/>
+          <w:szCs w:val="21"/>
+        </w:rPr>
+        <w:t xml:space="preserve">"Propuesta de excelencia que aporta a la matriz de turismo inclusivo y regenerativo. La solidez biológica y etológica del equipo garantiza una experiencia auténtica y memorable."</w:t>
+      </w:r>
+    </w:p>
+    <w:p>
+      <w:pPr>
+        <w:pStyle w:val="Heading1"/>
+        <w:spacing w:after="150" w:before="400"/>
+      </w:pPr>
+      <w:r>
+        <w:rPr>
+          <w:rFonts w:ascii="Calibri" w:cs="Calibri" w:eastAsia="Calibri" w:hAnsi="Calibri"/>
+          <w:b/>
+          <w:bCs/>
+          <w:color w:val="1B365D"/>
+          <w:sz w:val="28"/>
+          <w:szCs w:val="28"/>
+        </w:rPr>
+        <w:t xml:space="preserve">4. Matriz de Trabas y Obstáculos Identificados</w:t>
+      </w:r>
+    </w:p>
+    <w:p>
+      <w:pPr>
+        <w:spacing w:after="80" w:before="80" w:line="276"/>
+        <w:jc w:val="left"/>
+      </w:pPr>
+      <w:r>
+        <w:rPr>
+          <w:rFonts w:ascii="Calibri" w:cs="Calibri" w:eastAsia="Calibri" w:hAnsi="Calibri"/>
+          <w:b w:val="false"/>
+          <w:bCs w:val="false"/>
+          <w:i w:val="false"/>
+          <w:iCs w:val="false"/>
+          <w:color w:val="333333"/>
+          <w:sz w:val="21"/>
+          <w:szCs w:val="21"/>
+        </w:rPr>
+        <w:t xml:space="preserve">El plan operativo aborda cuatro trabas concretas identificadas en la entrevista:</w:t>
       </w:r>
     </w:p>
     <w:p>
@@ -708,16 +709,16 @@
           <w:sz w:val="21"/>
           <w:szCs w:val="21"/>
         </w:rPr>
-        <w:t xml:space="preserve">Traba 2: Estacionalidad invernal y costo de forraje. </w:t>
-      </w:r>
-      <w:r>
-        <w:rPr>
-          <w:rFonts w:ascii="Calibri" w:cs="Calibri" w:eastAsia="Calibri" w:hAnsi="Calibri"/>
-          <w:color w:val="333333"/>
-          <w:sz w:val="21"/>
-          <w:szCs w:val="21"/>
-        </w:rPr>
-        <w:t xml:space="preserve">Cierre de actividades turísticas en invierno por falta de pasturas naturales en El Pinar. Solución: creación de un fondo de sustentabilidad forrajera a partir de la comercialización de cupos turísticos en temporada media y convenios con escuelas.</w:t>
+        <w:t xml:space="preserve">Traba 1: Ingreso desordenado en tranquera y dispersión de consultas. </w:t>
+      </w:r>
+      <w:r>
+        <w:rPr>
+          <w:rFonts w:ascii="Calibri" w:cs="Calibri" w:eastAsia="Calibri" w:hAnsi="Calibri"/>
+          <w:color w:val="333333"/>
+          <w:sz w:val="21"/>
+          <w:szCs w:val="21"/>
+        </w:rPr>
+        <w:t xml:space="preserve">Visitantes que ingresaban espontáneamente sin turno previo, interrumpiendo sesiones de equinoterapia o tareas de alimentación. Solución: cartelería de tranquera "Abierto / Cerrado", días y horarios fijos semanales (miércoles y sábados) y sistema de reservas online con antelación obligatoria.</w:t>
       </w:r>
     </w:p>
     <w:p>
@@ -738,16 +739,16 @@
           <w:sz w:val="21"/>
           <w:szCs w:val="21"/>
         </w:rPr>
-        <w:t xml:space="preserve">Traba 3: Comercialización informal y falta de convenios B2B. </w:t>
-      </w:r>
-      <w:r>
-        <w:rPr>
-          <w:rFonts w:ascii="Calibri" w:cs="Calibri" w:eastAsia="Calibri" w:hAnsi="Calibri"/>
-          <w:color w:val="333333"/>
-          <w:sz w:val="21"/>
-          <w:szCs w:val="21"/>
-        </w:rPr>
-        <w:t xml:space="preserve">Dependencia del "boca en boca" y consultas espontáneas por redes sociales, sin acuerdos formales con agencias receptivas de Esquel y Trevelin ni mostradores de hoteles. Solución: confección de ficha tarifaria comercial con comisiones del 20-25% y rondas comerciales B2B.</w:t>
+        <w:t xml:space="preserve">Traba 2: Subsidio forrajero invernal. </w:t>
+      </w:r>
+      <w:r>
+        <w:rPr>
+          <w:rFonts w:ascii="Calibri" w:cs="Calibri" w:eastAsia="Calibri" w:hAnsi="Calibri"/>
+          <w:color w:val="333333"/>
+          <w:sz w:val="21"/>
+          <w:szCs w:val="21"/>
+        </w:rPr>
+        <w:t xml:space="preserve">Alto costo de compra de forraje para los caballos durante los meses fríos. Solución: fijación de una cuota de ingresos turísticos estacionales destinada a un fondo rotatorio de alimentación invernal.</w:t>
       </w:r>
     </w:p>
     <w:p>
@@ -768,69 +769,16 @@
           <w:sz w:val="21"/>
           <w:szCs w:val="21"/>
         </w:rPr>
-        <w:t xml:space="preserve">Traba 4: Punto de venta físico y monetización de souvenirs. </w:t>
-      </w:r>
-      <w:r>
-        <w:rPr>
-          <w:rFonts w:ascii="Calibri" w:cs="Calibri" w:eastAsia="Calibri" w:hAnsi="Calibri"/>
-          <w:color w:val="333333"/>
-          <w:sz w:val="21"/>
-          <w:szCs w:val="21"/>
-        </w:rPr>
-        <w:t xml:space="preserve">Inexistencia de un rincón de exhibición y comercialización de recuerdos en el predio. Solución: acondicionamiento de la matera histórica y prototipado del Kit "Pequeño Cuidador de Animales / Guardián de Lucero", semillas y compost.</w:t>
-      </w:r>
-    </w:p>
-    <w:p>
-      <w:pPr>
-        <w:pStyle w:val="Heading1"/>
-        <w:spacing w:after="150" w:before="400"/>
-      </w:pPr>
-      <w:r>
-        <w:rPr>
-          <w:rFonts w:ascii="Calibri" w:cs="Calibri" w:eastAsia="Calibri" w:hAnsi="Calibri"/>
-          <w:b/>
-          <w:bCs/>
-          <w:color w:val="1B365D"/>
-          <w:sz w:val="28"/>
-          <w:szCs w:val="28"/>
-        </w:rPr>
-        <w:t xml:space="preserve">5. Ejes Estratégicos de Trabajo</w:t>
-      </w:r>
-    </w:p>
-    <w:p>
-      <w:pPr>
-        <w:spacing w:after="80" w:before="80" w:line="276"/>
-        <w:jc w:val="left"/>
-      </w:pPr>
-      <w:r>
-        <w:rPr>
-          <w:rFonts w:ascii="Calibri" w:cs="Calibri" w:eastAsia="Calibri" w:hAnsi="Calibri"/>
-          <w:b w:val="false"/>
-          <w:bCs w:val="false"/>
-          <w:i w:val="false"/>
-          <w:iCs w:val="false"/>
-          <w:color w:val="333333"/>
-          <w:sz w:val="21"/>
-          <w:szCs w:val="21"/>
-        </w:rPr>
-        <w:t xml:space="preserve">El acompañamiento técnico de la Célula 2 se articula en tres ejes complementarios:</w:t>
-      </w:r>
-    </w:p>
-    <w:p>
-      <w:pPr>
-        <w:pStyle w:val="Heading2"/>
-        <w:spacing w:after="100" w:before="250"/>
-      </w:pPr>
-      <w:r>
-        <w:rPr>
-          <w:rFonts w:ascii="Calibri" w:cs="Calibri" w:eastAsia="Calibri" w:hAnsi="Calibri"/>
-          <w:b/>
-          <w:bCs/>
-          <w:color w:val="2C5E7A"/>
-          <w:sz w:val="24"/>
-          <w:szCs w:val="24"/>
-        </w:rPr>
-        <w:t xml:space="preserve">Eje 1: Curaduría de 2 Experiencias Turísticas Estrella y Bioseguridad</w:t>
+        <w:t xml:space="preserve">Traba 3: Brecha digital y canal de comercialización centralizado. </w:t>
+      </w:r>
+      <w:r>
+        <w:rPr>
+          <w:rFonts w:ascii="Calibri" w:cs="Calibri" w:eastAsia="Calibri" w:hAnsi="Calibri"/>
+          <w:color w:val="333333"/>
+          <w:sz w:val="21"/>
+          <w:szCs w:val="21"/>
+        </w:rPr>
+        <w:t xml:space="preserve">Falta de página web propia y pérdida de mensajes en redes sociales. Solución: desarrollo de una plataforma web transaccional con backend administrativo para gestionar cupos, seguros y estadísticas.</w:t>
       </w:r>
     </w:p>
     <w:p>
@@ -851,16 +799,69 @@
           <w:sz w:val="21"/>
           <w:szCs w:val="21"/>
         </w:rPr>
-        <w:t xml:space="preserve">Experiencia 1: "Granja Educativa &amp; Saberes Vivos" (75 min / Familiar / Niños): </w:t>
-      </w:r>
-      <w:r>
-        <w:rPr>
-          <w:rFonts w:ascii="Calibri" w:cs="Calibri" w:eastAsia="Calibri" w:hAnsi="Calibri"/>
-          <w:color w:val="333333"/>
-          <w:sz w:val="21"/>
-          <w:szCs w:val="21"/>
-        </w:rPr>
-        <w:t xml:space="preserve">Recorrido interpretativo por los corrales guiado por Sol y voluntarios. Rescate de chinchillas, ratas de laboratorio y cerdita Rita Uva; homenaje a Pamperito (35 años); pautas de bienestar animal y entrega del Kit del Pequeño Cuidador.</w:t>
+        <w:t xml:space="preserve">Traba 4: Punto de venta y monetización de recuerdos. </w:t>
+      </w:r>
+      <w:r>
+        <w:rPr>
+          <w:rFonts w:ascii="Calibri" w:cs="Calibri" w:eastAsia="Calibri" w:hAnsi="Calibri"/>
+          <w:color w:val="333333"/>
+          <w:sz w:val="21"/>
+          <w:szCs w:val="21"/>
+        </w:rPr>
+        <w:t xml:space="preserve">Inexistencia de un espacio rústico de venta de recuerdos y economía circular. Solución: acondicionamiento de la matera histórica y producción del Kit infantil "Pequeño Cuidador / Guardián de Lucero", sobres de compost y semillas nativas.</w:t>
+      </w:r>
+    </w:p>
+    <w:p>
+      <w:pPr>
+        <w:pStyle w:val="Heading1"/>
+        <w:spacing w:after="150" w:before="400"/>
+      </w:pPr>
+      <w:r>
+        <w:rPr>
+          <w:rFonts w:ascii="Calibri" w:cs="Calibri" w:eastAsia="Calibri" w:hAnsi="Calibri"/>
+          <w:b/>
+          <w:bCs/>
+          <w:color w:val="1B365D"/>
+          <w:sz w:val="28"/>
+          <w:szCs w:val="28"/>
+        </w:rPr>
+        <w:t xml:space="preserve">5. Ejes Estratégicos de Trabajo</w:t>
+      </w:r>
+    </w:p>
+    <w:p>
+      <w:pPr>
+        <w:spacing w:after="80" w:before="80" w:line="276"/>
+        <w:jc w:val="left"/>
+      </w:pPr>
+      <w:r>
+        <w:rPr>
+          <w:rFonts w:ascii="Calibri" w:cs="Calibri" w:eastAsia="Calibri" w:hAnsi="Calibri"/>
+          <w:b w:val="false"/>
+          <w:bCs w:val="false"/>
+          <w:i w:val="false"/>
+          <w:iCs w:val="false"/>
+          <w:color w:val="333333"/>
+          <w:sz w:val="21"/>
+          <w:szCs w:val="21"/>
+        </w:rPr>
+        <w:t xml:space="preserve">El trabajo con la Célula 2 se divide en tres ejes estratégicos concurrentes:</w:t>
+      </w:r>
+    </w:p>
+    <w:p>
+      <w:pPr>
+        <w:pStyle w:val="Heading2"/>
+        <w:spacing w:after="100" w:before="250"/>
+      </w:pPr>
+      <w:r>
+        <w:rPr>
+          <w:rFonts w:ascii="Calibri" w:cs="Calibri" w:eastAsia="Calibri" w:hAnsi="Calibri"/>
+          <w:b/>
+          <w:bCs/>
+          <w:color w:val="2C5E7A"/>
+          <w:sz w:val="24"/>
+          <w:szCs w:val="24"/>
+        </w:rPr>
+        <w:t xml:space="preserve">Eje 1: Estandarización de 2 Experiencias Estrella y Seguridad</w:t>
       </w:r>
     </w:p>
     <w:p>
@@ -881,16 +882,16 @@
           <w:sz w:val="21"/>
           <w:szCs w:val="21"/>
         </w:rPr>
-        <w:t xml:space="preserve">Experiencia 2: "Bautismo Ecuestre &amp; Encuentro con el Caballo" (90 min / Jóvenes y Adultos): </w:t>
-      </w:r>
-      <w:r>
-        <w:rPr>
-          <w:rFonts w:ascii="Calibri" w:cs="Calibri" w:eastAsia="Calibri" w:hAnsi="Calibri"/>
-          <w:color w:val="333333"/>
-          <w:sz w:val="21"/>
-          <w:szCs w:val="21"/>
-        </w:rPr>
-        <w:t xml:space="preserve">Encuentro etológico pie a tierra: ir a buscar al caballo a la pastura, cepillado, entendimiento de señales corporales, nociones de monta consciente (individual o asistida/doble) y paseo guiado por El Pinar.</w:t>
+        <w:t xml:space="preserve">Experiencia 1: "Granja Educativa &amp; Saberes Vivos" (75 min / Miércoles y Sábados): </w:t>
+      </w:r>
+      <w:r>
+        <w:rPr>
+          <w:rFonts w:ascii="Calibri" w:cs="Calibri" w:eastAsia="Calibri" w:hAnsi="Calibri"/>
+          <w:color w:val="333333"/>
+          <w:sz w:val="21"/>
+          <w:szCs w:val="21"/>
+        </w:rPr>
+        <w:t xml:space="preserve">Visita guiada por corrales con relatos de rescate de animales (Rita Uva, Pamperito, chinchillas), alimentación consciente, pautas de respeto animal, recorrida por la matera y merienda de campo. Actividad accesible que no requiere seguro ecuestre de monta.</w:t>
       </w:r>
     </w:p>
     <w:p>
@@ -911,33 +912,16 @@
           <w:sz w:val="21"/>
           <w:szCs w:val="21"/>
         </w:rPr>
-        <w:t xml:space="preserve">Protocolo de Seguridad y Deslindes: </w:t>
-      </w:r>
-      <w:r>
-        <w:rPr>
-          <w:rFonts w:ascii="Calibri" w:cs="Calibri" w:eastAsia="Calibri" w:hAnsi="Calibri"/>
-          <w:color w:val="333333"/>
-          <w:sz w:val="21"/>
-          <w:szCs w:val="21"/>
-        </w:rPr>
-        <w:t xml:space="preserve">Formalización de seguros de turismo activo ecuestre, uso de cascos homologados y fichas de deslinde de responsabilidad civil.</w:t>
-      </w:r>
-    </w:p>
-    <w:p>
-      <w:pPr>
-        <w:pStyle w:val="Heading2"/>
-        <w:spacing w:after="100" w:before="250"/>
-      </w:pPr>
-      <w:r>
-        <w:rPr>
-          <w:rFonts w:ascii="Calibri" w:cs="Calibri" w:eastAsia="Calibri" w:hAnsi="Calibri"/>
-          <w:b/>
-          <w:bCs/>
-          <w:color w:val="2C5E7A"/>
-          <w:sz w:val="24"/>
-          <w:szCs w:val="24"/>
-        </w:rPr>
-        <w:t xml:space="preserve">Eje 2: Desarrollo del Kit "Pequeño Cuidador" y Productos de Granja</w:t>
+        <w:t xml:space="preserve">Experiencia 2: "Bautismo Ecuestre &amp; Vínculo Consciente" (90 min / Con Reserva Previa): </w:t>
+      </w:r>
+      <w:r>
+        <w:rPr>
+          <w:rFonts w:ascii="Calibri" w:cs="Calibri" w:eastAsia="Calibri" w:hAnsi="Calibri"/>
+          <w:color w:val="333333"/>
+          <w:sz w:val="21"/>
+          <w:szCs w:val="21"/>
+        </w:rPr>
+        <w:t xml:space="preserve">Encuentro etológico pie a tierra: búsqueda del caballo en pasturas, cepillado, entendimiento corporal, test previo en pista de monta y paseo guiado por El Pinar. Exige alta de seguro médico previo y uso obligatorio de casco homologado.</w:t>
       </w:r>
     </w:p>
     <w:p>
@@ -958,16 +942,33 @@
           <w:sz w:val="21"/>
           <w:szCs w:val="21"/>
         </w:rPr>
-        <w:t xml:space="preserve">Kit "Pequeño Cuidador / Guardián de Lucero": </w:t>
-      </w:r>
-      <w:r>
-        <w:rPr>
-          <w:rFonts w:ascii="Calibri" w:cs="Calibri" w:eastAsia="Calibri" w:hAnsi="Calibri"/>
-          <w:color w:val="333333"/>
-          <w:sz w:val="21"/>
-          <w:szCs w:val="21"/>
-        </w:rPr>
-        <w:t xml:space="preserve">Libreta de campo ilustrada con actividades (identificación de huellas, hábitos de animales, anécdotas), lápiz de madera, pin metálico oficial y certificación de "Guardián de Lucero".</w:t>
+        <w:t xml:space="preserve">Protocolos y Cartelería de Predio: </w:t>
+      </w:r>
+      <w:r>
+        <w:rPr>
+          <w:rFonts w:ascii="Calibri" w:cs="Calibri" w:eastAsia="Calibri" w:hAnsi="Calibri"/>
+          <w:color w:val="333333"/>
+          <w:sz w:val="21"/>
+          <w:szCs w:val="21"/>
+        </w:rPr>
+        <w:t xml:space="preserve">Instalación del cartel de tranquera "Abierto / Cerrado", delimitación de senderos en El Pinar y fichas de deslinde de responsabilidad.</w:t>
+      </w:r>
+    </w:p>
+    <w:p>
+      <w:pPr>
+        <w:pStyle w:val="Heading2"/>
+        <w:spacing w:after="100" w:before="250"/>
+      </w:pPr>
+      <w:r>
+        <w:rPr>
+          <w:rFonts w:ascii="Calibri" w:cs="Calibri" w:eastAsia="Calibri" w:hAnsi="Calibri"/>
+          <w:b/>
+          <w:bCs/>
+          <w:color w:val="2C5E7A"/>
+          <w:sz w:val="24"/>
+          <w:szCs w:val="24"/>
+        </w:rPr>
+        <w:t xml:space="preserve">Eje 2: Desarrollo Web Transaccional, Píldoras Audiovisuales y Kits</w:t>
       </w:r>
     </w:p>
     <w:p>
@@ -988,33 +989,16 @@
           <w:sz w:val="21"/>
           <w:szCs w:val="21"/>
         </w:rPr>
-        <w:t xml:space="preserve">Línea de la Granja y Economía Circular: </w:t>
-      </w:r>
-      <w:r>
-        <w:rPr>
-          <w:rFonts w:ascii="Calibri" w:cs="Calibri" w:eastAsia="Calibri" w:hAnsi="Calibri"/>
-          <w:color w:val="333333"/>
-          <w:sz w:val="21"/>
-          <w:szCs w:val="21"/>
-        </w:rPr>
-        <w:t xml:space="preserve">Sobres de compost producido en el centro, semillas de flora nativa con instructivo de siembra y cuaderno editorial "Historias de Lucero". Adecuación de un puesto rústico de venta en la matera histórica.</w:t>
-      </w:r>
-    </w:p>
-    <w:p>
-      <w:pPr>
-        <w:pStyle w:val="Heading2"/>
-        <w:spacing w:after="100" w:before="250"/>
-      </w:pPr>
-      <w:r>
-        <w:rPr>
-          <w:rFonts w:ascii="Calibri" w:cs="Calibri" w:eastAsia="Calibri" w:hAnsi="Calibri"/>
-          <w:b/>
-          <w:bCs/>
-          <w:color w:val="2C5E7A"/>
-          <w:sz w:val="24"/>
-          <w:szCs w:val="24"/>
-        </w:rPr>
-        <w:t xml:space="preserve">Eje 3: Estructura de Costos, Alianzas B2B y Ecosistema de Cohorte</w:t>
+        <w:t xml:space="preserve">Plataforma Web y Backend de Gestión (Compromiso Leandro Choi): </w:t>
+      </w:r>
+      <w:r>
+        <w:rPr>
+          <w:rFonts w:ascii="Calibri" w:cs="Calibri" w:eastAsia="Calibri" w:hAnsi="Calibri"/>
+          <w:color w:val="333333"/>
+          <w:sz w:val="21"/>
+          <w:szCs w:val="21"/>
+        </w:rPr>
+        <w:t xml:space="preserve">Sitio web oficial con historia institucional de Lucero, catálogo de experiencias, pasarela de cobro Mercado Pago y panel administrativo para fijar días habilitados y antelación mínima para seguros.</w:t>
       </w:r>
     </w:p>
     <w:p>
@@ -1035,16 +1019,16 @@
           <w:sz w:val="21"/>
           <w:szCs w:val="21"/>
         </w:rPr>
-        <w:t xml:space="preserve">Planilla paramétrica de costos y tarifario B2C/B2B: </w:t>
-      </w:r>
-      <w:r>
-        <w:rPr>
-          <w:rFonts w:ascii="Calibri" w:cs="Calibri" w:eastAsia="Calibri" w:hAnsi="Calibri"/>
-          <w:color w:val="333333"/>
-          <w:sz w:val="21"/>
-          <w:szCs w:val="21"/>
-        </w:rPr>
-        <w:t xml:space="preserve">Costeo integral que absorbe la compra de forraje invernal, honorarios de guías/terapeutas y comisión para agencias de viajes receptivas de Esquel y Trevelin.</w:t>
+        <w:t xml:space="preserve">Producción Audiovisual 4K y Dron: </w:t>
+      </w:r>
+      <w:r>
+        <w:rPr>
+          <w:rFonts w:ascii="Calibri" w:cs="Calibri" w:eastAsia="Calibri" w:hAnsi="Calibri"/>
+          <w:color w:val="333333"/>
+          <w:sz w:val="21"/>
+          <w:szCs w:val="21"/>
+        </w:rPr>
+        <w:t xml:space="preserve">Rodaje de micro-documentales: historia de Sol y su abuelo Toto Arrechea; tomas aéreas de coaching en El Pinar; y testimonios de niños del programa "Guardianes de Lucero".</w:t>
       </w:r>
     </w:p>
     <w:p>
@@ -1065,52 +1049,33 @@
           <w:sz w:val="21"/>
           <w:szCs w:val="21"/>
         </w:rPr>
-        <w:t xml:space="preserve">Sinergias de Cohorte y Eventos Culturales: </w:t>
-      </w:r>
-      <w:r>
-        <w:rPr>
-          <w:rFonts w:ascii="Calibri" w:cs="Calibri" w:eastAsia="Calibri" w:hAnsi="Calibri"/>
-          <w:color w:val="333333"/>
-          <w:sz w:val="21"/>
-          <w:szCs w:val="21"/>
-        </w:rPr>
-        <w:t xml:space="preserve">Articulación con Haiku Casa de Té (retiros de bienestar y té en El Pinar), Pausa de Ñire y True Patagonia. Consolidación de la feria comunitaria "El Paseo del Pinar" en el calendario turístico comarcal.</w:t>
-      </w:r>
-    </w:p>
-    <w:p>
-      <w:pPr>
-        <w:pStyle w:val="Heading1"/>
-        <w:spacing w:after="150" w:before="400"/>
-      </w:pPr>
-      <w:r>
-        <w:rPr>
-          <w:rFonts w:ascii="Calibri" w:cs="Calibri" w:eastAsia="Calibri" w:hAnsi="Calibri"/>
-          <w:b/>
-          <w:bCs/>
-          <w:color w:val="1B365D"/>
-          <w:sz w:val="28"/>
-          <w:szCs w:val="28"/>
-        </w:rPr>
-        <w:t xml:space="preserve">6. Entregables y Metas Comprometidas</w:t>
-      </w:r>
-    </w:p>
-    <w:p>
-      <w:pPr>
-        <w:spacing w:after="80" w:before="80" w:line="276"/>
-        <w:jc w:val="left"/>
-      </w:pPr>
-      <w:r>
-        <w:rPr>
-          <w:rFonts w:ascii="Calibri" w:cs="Calibri" w:eastAsia="Calibri" w:hAnsi="Calibri"/>
-          <w:b w:val="false"/>
-          <w:bCs w:val="false"/>
-          <w:i w:val="false"/>
-          <w:iCs w:val="false"/>
-          <w:color w:val="333333"/>
-          <w:sz w:val="21"/>
-          <w:szCs w:val="21"/>
-        </w:rPr>
-        <w:t xml:space="preserve">Al cabo de las 8 semanas, el centro contará con los siguientes 5 entregables verificables:</w:t>
+        <w:t xml:space="preserve">Kit "Pequeño Cuidador de Animales / Guardián de Lucero": </w:t>
+      </w:r>
+      <w:r>
+        <w:rPr>
+          <w:rFonts w:ascii="Calibri" w:cs="Calibri" w:eastAsia="Calibri" w:hAnsi="Calibri"/>
+          <w:color w:val="333333"/>
+          <w:sz w:val="21"/>
+          <w:szCs w:val="21"/>
+        </w:rPr>
+        <w:t xml:space="preserve">Libreta de campo ilustrada, lápiz ecológico de madera, guía de huellas y pin metálico oficial para entregar a niños en visitas y ferias.</w:t>
+      </w:r>
+    </w:p>
+    <w:p>
+      <w:pPr>
+        <w:pStyle w:val="Heading2"/>
+        <w:spacing w:after="100" w:before="250"/>
+      </w:pPr>
+      <w:r>
+        <w:rPr>
+          <w:rFonts w:ascii="Calibri" w:cs="Calibri" w:eastAsia="Calibri" w:hAnsi="Calibri"/>
+          <w:b/>
+          <w:bCs/>
+          <w:color w:val="2C5E7A"/>
+          <w:sz w:val="24"/>
+          <w:szCs w:val="24"/>
+        </w:rPr>
+        <w:t xml:space="preserve">Eje 3: Estructura de Costos, Alianzas B2B y Eventos</w:t>
       </w:r>
     </w:p>
     <w:p>
@@ -1131,16 +1096,16 @@
           <w:sz w:val="21"/>
           <w:szCs w:val="21"/>
         </w:rPr>
-        <w:t xml:space="preserve">Entregable 1: </w:t>
-      </w:r>
-      <w:r>
-        <w:rPr>
-          <w:rFonts w:ascii="Calibri" w:cs="Calibri" w:eastAsia="Calibri" w:hAnsi="Calibri"/>
-          <w:color w:val="333333"/>
-          <w:sz w:val="21"/>
-          <w:szCs w:val="21"/>
-        </w:rPr>
-        <w:t xml:space="preserve">Guion interpretativo y fichas técnicas estandarizadas de las 2 Experiencias Turísticas ("Granja Educativa" y "Bautismo Ecuestre").</w:t>
+        <w:t xml:space="preserve">Planilla paramétrica de costos y tarifario B2C/B2B: </w:t>
+      </w:r>
+      <w:r>
+        <w:rPr>
+          <w:rFonts w:ascii="Calibri" w:cs="Calibri" w:eastAsia="Calibri" w:hAnsi="Calibri"/>
+          <w:color w:val="333333"/>
+          <w:sz w:val="21"/>
+          <w:szCs w:val="21"/>
+        </w:rPr>
+        <w:t xml:space="preserve">Readecuación de tarifas frente a la referencia de mercado ($90.000 en cabalgatas comarcales), fijando tarifas transparentes con comisiones del 20-25% para agencias receptivas de Esquel y Trevelin.</w:t>
       </w:r>
     </w:p>
     <w:p>
@@ -1161,16 +1126,52 @@
           <w:sz w:val="21"/>
           <w:szCs w:val="21"/>
         </w:rPr>
-        <w:t xml:space="preserve">Entregable 2: </w:t>
-      </w:r>
-      <w:r>
-        <w:rPr>
-          <w:rFonts w:ascii="Calibri" w:cs="Calibri" w:eastAsia="Calibri" w:hAnsi="Calibri"/>
-          <w:color w:val="333333"/>
-          <w:sz w:val="21"/>
-          <w:szCs w:val="21"/>
-        </w:rPr>
-        <w:t xml:space="preserve">Protocolo de bioseguridad ecuestre, formulario de deslinde de responsabilidad y manual de bienestar animal.</w:t>
+        <w:t xml:space="preserve">Alianzas de Cohorte y Feria "El Paseo del Pinar": </w:t>
+      </w:r>
+      <w:r>
+        <w:rPr>
+          <w:rFonts w:ascii="Calibri" w:cs="Calibri" w:eastAsia="Calibri" w:hAnsi="Calibri"/>
+          <w:color w:val="333333"/>
+          <w:sz w:val="21"/>
+          <w:szCs w:val="21"/>
+        </w:rPr>
+        <w:t xml:space="preserve">Articulación con Haiku Casa de Té (retiros de meditación y té en El Pinar) y fecha confirmada para la feria comunitaria con artesanos y gastronomía campesina.</w:t>
+      </w:r>
+    </w:p>
+    <w:p>
+      <w:pPr>
+        <w:pStyle w:val="Heading1"/>
+        <w:spacing w:after="150" w:before="400"/>
+      </w:pPr>
+      <w:r>
+        <w:rPr>
+          <w:rFonts w:ascii="Calibri" w:cs="Calibri" w:eastAsia="Calibri" w:hAnsi="Calibri"/>
+          <w:b/>
+          <w:bCs/>
+          <w:color w:val="1B365D"/>
+          <w:sz w:val="28"/>
+          <w:szCs w:val="28"/>
+        </w:rPr>
+        <w:t xml:space="preserve">6. Entregables y Metas Comprometidas</w:t>
+      </w:r>
+    </w:p>
+    <w:p>
+      <w:pPr>
+        <w:spacing w:after="80" w:before="80" w:line="276"/>
+        <w:jc w:val="left"/>
+      </w:pPr>
+      <w:r>
+        <w:rPr>
+          <w:rFonts w:ascii="Calibri" w:cs="Calibri" w:eastAsia="Calibri" w:hAnsi="Calibri"/>
+          <w:b w:val="false"/>
+          <w:bCs w:val="false"/>
+          <w:i w:val="false"/>
+          <w:iCs w:val="false"/>
+          <w:color w:val="333333"/>
+          <w:sz w:val="21"/>
+          <w:szCs w:val="21"/>
+        </w:rPr>
+        <w:t xml:space="preserve">Al culminar las 8 semanas de asistencia técnica, Lucero dispondrá de 5 entregables consolidados:</w:t>
       </w:r>
     </w:p>
     <w:p>
@@ -1191,16 +1192,16 @@
           <w:sz w:val="21"/>
           <w:szCs w:val="21"/>
         </w:rPr>
-        <w:t xml:space="preserve">Entregable 3: </w:t>
-      </w:r>
-      <w:r>
-        <w:rPr>
-          <w:rFonts w:ascii="Calibri" w:cs="Calibri" w:eastAsia="Calibri" w:hAnsi="Calibri"/>
-          <w:color w:val="333333"/>
-          <w:sz w:val="21"/>
-          <w:szCs w:val="21"/>
-        </w:rPr>
-        <w:t xml:space="preserve">Prototipo impreso del Kit "Pequeño Cuidador de Animales / Guardián de Lucero" (libreta, pin y empaque).</w:t>
+        <w:t xml:space="preserve">Entregable 1: </w:t>
+      </w:r>
+      <w:r>
+        <w:rPr>
+          <w:rFonts w:ascii="Calibri" w:cs="Calibri" w:eastAsia="Calibri" w:hAnsi="Calibri"/>
+          <w:color w:val="333333"/>
+          <w:sz w:val="21"/>
+          <w:szCs w:val="21"/>
+        </w:rPr>
+        <w:t xml:space="preserve">Guion técnico y fichas operativas de las 2 Experiencias ("Granja Educativa" y "Bautismo Ecuestre") con horarios y cupos fijados.</w:t>
       </w:r>
     </w:p>
     <w:p>
@@ -1221,16 +1222,16 @@
           <w:sz w:val="21"/>
           <w:szCs w:val="21"/>
         </w:rPr>
-        <w:t xml:space="preserve">Entregable 4: </w:t>
-      </w:r>
-      <w:r>
-        <w:rPr>
-          <w:rFonts w:ascii="Calibri" w:cs="Calibri" w:eastAsia="Calibri" w:hAnsi="Calibri"/>
-          <w:color w:val="333333"/>
-          <w:sz w:val="21"/>
-          <w:szCs w:val="21"/>
-        </w:rPr>
-        <w:t xml:space="preserve">Planilla paramétrica de costos con amortización de forraje invernal y tarifario comercial minorista/mayorista (B2C/B2B).</w:t>
+        <w:t xml:space="preserve">Entregable 2: </w:t>
+      </w:r>
+      <w:r>
+        <w:rPr>
+          <w:rFonts w:ascii="Calibri" w:cs="Calibri" w:eastAsia="Calibri" w:hAnsi="Calibri"/>
+          <w:color w:val="333333"/>
+          <w:sz w:val="21"/>
+          <w:szCs w:val="21"/>
+        </w:rPr>
+        <w:t xml:space="preserve">Protocolo de bioseguridad, circuito de seguros con Patagonia Broker / Mercantil Andina y cartelería de tranquera.</w:t>
       </w:r>
     </w:p>
     <w:p>
@@ -1251,6 +1252,66 @@
           <w:sz w:val="21"/>
           <w:szCs w:val="21"/>
         </w:rPr>
+        <w:t xml:space="preserve">Entregable 3: </w:t>
+      </w:r>
+      <w:r>
+        <w:rPr>
+          <w:rFonts w:ascii="Calibri" w:cs="Calibri" w:eastAsia="Calibri" w:hAnsi="Calibri"/>
+          <w:color w:val="333333"/>
+          <w:sz w:val="21"/>
+          <w:szCs w:val="21"/>
+        </w:rPr>
+        <w:t xml:space="preserve">Sitio web transaccional con backend de reservas y banco de 30 fotos 4K y 3 píldoras audiovisuales documentales.</w:t>
+      </w:r>
+    </w:p>
+    <w:p>
+      <w:pPr>
+        <w:pStyle w:val="ListParagraph"/>
+        <w:numPr>
+          <w:ilvl w:val="0"/>
+          <w:numId w:val="1"/>
+        </w:numPr>
+        <w:spacing w:after="40" w:before="40" w:line="260"/>
+      </w:pPr>
+      <w:r>
+        <w:rPr>
+          <w:rFonts w:ascii="Calibri" w:cs="Calibri" w:eastAsia="Calibri" w:hAnsi="Calibri"/>
+          <w:b/>
+          <w:bCs/>
+          <w:color w:val="222222"/>
+          <w:sz w:val="21"/>
+          <w:szCs w:val="21"/>
+        </w:rPr>
+        <w:t xml:space="preserve">Entregable 4: </w:t>
+      </w:r>
+      <w:r>
+        <w:rPr>
+          <w:rFonts w:ascii="Calibri" w:cs="Calibri" w:eastAsia="Calibri" w:hAnsi="Calibri"/>
+          <w:color w:val="333333"/>
+          <w:sz w:val="21"/>
+          <w:szCs w:val="21"/>
+        </w:rPr>
+        <w:t xml:space="preserve">Prototipo impreso del Kit infantil "Pequeño Cuidador / Guardián de Lucero" (libreta, pin y packaging).</w:t>
+      </w:r>
+    </w:p>
+    <w:p>
+      <w:pPr>
+        <w:pStyle w:val="ListParagraph"/>
+        <w:numPr>
+          <w:ilvl w:val="0"/>
+          <w:numId w:val="1"/>
+        </w:numPr>
+        <w:spacing w:after="40" w:before="40" w:line="260"/>
+      </w:pPr>
+      <w:r>
+        <w:rPr>
+          <w:rFonts w:ascii="Calibri" w:cs="Calibri" w:eastAsia="Calibri" w:hAnsi="Calibri"/>
+          <w:b/>
+          <w:bCs/>
+          <w:color w:val="222222"/>
+          <w:sz w:val="21"/>
+          <w:szCs w:val="21"/>
+        </w:rPr>
         <w:t xml:space="preserve">Entregable 5: </w:t>
       </w:r>
       <w:r>
@@ -1260,7 +1321,7 @@
           <w:sz w:val="21"/>
           <w:szCs w:val="21"/>
         </w:rPr>
-        <w:t xml:space="preserve">Convenio de comercialización turística con al menos 2 agencias receptivas habilitadas de Esquel/Trevelin y catálogo digital publicado.</w:t>
+        <w:t xml:space="preserve">Planilla de costeo paramétrico con absorción de forraje invernal, tarifario oficial y convenios con agencias receptivas de Esquel y Trevelin.</w:t>
       </w:r>
     </w:p>
     <w:p>
@@ -1511,7 +1572,7 @@
                 <w:sz w:val="18"/>
                 <w:szCs w:val="18"/>
               </w:rPr>
-              <w:t xml:space="preserve">Diagnóstico integral en predio, relevamiento de corrales y El Pinar</w:t>
+              <w:t xml:space="preserve">Relevamiento de corrales, El Pinar y ciclo de suelo de primavera</w:t>
             </w:r>
           </w:p>
           <w:p>
@@ -1530,7 +1591,7 @@
                 <w:sz w:val="17"/>
                 <w:szCs w:val="17"/>
               </w:rPr>
-              <w:t xml:space="preserve">Inspección de corrales de granja (chinchillas, ratas de laboratorio, cerdita Rita Uva, Pamperito de 35 años), pista de monta y matera histórica. Mapeo de senderos accesibles en El Pinar y delimitación de áreas de picnic.</w:t>
+              <w:t xml:space="preserve">Inspección de corrales de la granja (chinchillas, ratas de laboratorio, cerdita Rita Uva, Pamperito de 35 años), pista de monta y matera histórica. Verificación del recambio de suelo orgánico con compost y diseño del cartel de tranquera "Abierto / Cerrado".</w:t>
             </w:r>
           </w:p>
         </w:tc>
@@ -1565,9 +1626,9 @@
                 <w:sz w:val="16"/>
                 <w:szCs w:val="16"/>
               </w:rPr>
-              <w:t xml:space="preserve">• Inspeccionar corrales, pista y matera histórica
-• Croquis de zonificación y circuito de visita
-• Fijar días/horarios para visitas turísticas</w:t>
+              <w:t xml:space="preserve">• Inspección de corrales y plan de recambio de suelo
+• Croquis de circulación peatonal y zona de picnic
+• Diseño del cartel de tranquera Abierto/Cerrado</w:t>
             </w:r>
           </w:p>
         </w:tc>
@@ -1678,7 +1739,7 @@
                 <w:sz w:val="18"/>
                 <w:szCs w:val="18"/>
               </w:rPr>
-              <w:t xml:space="preserve">Estandarización de 2 Experiencias Turísticas y Protocolos de Bioseguridad</w:t>
+              <w:t xml:space="preserve">Estandarización de 2 Experiencias y Protocolo de Seguros</w:t>
             </w:r>
           </w:p>
           <w:p>
@@ -1697,7 +1758,7 @@
                 <w:sz w:val="17"/>
                 <w:szCs w:val="17"/>
               </w:rPr>
-              <w:t xml:space="preserve">Cerrar el guion de "Granja Educativa &amp; Saberes Vivos" y "Bautismo Ecuestre &amp; Vínculo Consciente". Definir protocolo de monta asistida/doble, deslindes de responsabilidad, cascos homologados y bienestar animal.</w:t>
+              <w:t xml:space="preserve">Cerrar guiones de "Granja Educativa" y "Bautismo Ecuestre". Protocolo de prueba obligatoria en pista antes de paseos para evaluar al jinete. Formalización del circuito de seguros directos con Patagonia Broker / Mercantil Andina.</w:t>
             </w:r>
           </w:p>
         </w:tc>
@@ -1733,8 +1794,8 @@
                 <w:szCs w:val="16"/>
               </w:rPr>
               <w:t xml:space="preserve">• Guion interpretativo de las 2 experiencias
-• Formulario de deslinde y seguro ecuestre
-• Inventario de cascos y monturas de escuela</w:t>
+• Protocolo de prueba en pista previa a paseos
+• Validación de canal ágil de seguros ecuestres</w:t>
             </w:r>
           </w:p>
         </w:tc>
@@ -1845,7 +1906,7 @@
                 <w:sz w:val="18"/>
                 <w:szCs w:val="18"/>
               </w:rPr>
-              <w:t xml:space="preserve">Estructura de costos, forraje invernal y tarifario comercial B2C/B2B</w:t>
+              <w:t xml:space="preserve">Estructura de costos, absorción forrajera y tarifario B2C/B2B</w:t>
             </w:r>
           </w:p>
           <w:p>
@@ -1864,7 +1925,7 @@
                 <w:sz w:val="17"/>
                 <w:szCs w:val="17"/>
               </w:rPr>
-              <w:t xml:space="preserve">Construir planilla de costeo que amortice el forraje invernal de caballos. Fijar tarifas por persona (B2C), pases familiares y comisiones del 20-25% para agencias de viajes receptivas de Esquel y Trevelin.</w:t>
+              <w:t xml:space="preserve">Planilla paramétrica de costos que absorba el forraje invernal (fardos de alfalfa y avena). Readecuación de tarifas turísticas frente a los $90.000 del mercado comarcal, manteniendo precios sociales para familias locales.</w:t>
             </w:r>
           </w:p>
         </w:tc>
@@ -1899,9 +1960,9 @@
                 <w:sz w:val="16"/>
                 <w:szCs w:val="16"/>
               </w:rPr>
-              <w:t xml:space="preserve">• Planilla paramétrica de costos en Drive/Excel
-• Ficha tarifaria para agencias y hoteles
-• Política de reservas y contingencia climática</w:t>
+              <w:t xml:space="preserve">• Planilla paramétrica de costos y fondo forrajero
+• Tarifario comercial cerrado minorista y mayorista
+• Política de cupos por turnos y reprogramación</w:t>
             </w:r>
           </w:p>
         </w:tc>
@@ -2012,7 +2073,7 @@
                 <w:sz w:val="18"/>
                 <w:szCs w:val="18"/>
               </w:rPr>
-              <w:t xml:space="preserve">Desarrollo del Kit "Pequeño Cuidador" y Merchandising con Identidad</w:t>
+              <w:t xml:space="preserve">Prototipado del Kit "Pequeño Cuidador" y Rincón en la Matera</w:t>
             </w:r>
           </w:p>
           <w:p>
@@ -2031,7 +2092,7 @@
                 <w:sz w:val="17"/>
                 <w:szCs w:val="17"/>
               </w:rPr>
-              <w:t xml:space="preserve">Diseño y prototipado del Kit "Pequeño Cuidador / Guardián de Lucero" (libreta ilustrada, lápiz ecológico, pin metálico). Cuaderno "Historias de Lucero" y sobres de compost y semillas. Organización del puesto en la matera.</w:t>
+              <w:t xml:space="preserve">Diseño pedagógico del Kit infantil (libreta de campo ilustrada, lápiz ecológico, pin metálico oficial). Cuaderno "Historias de Lucero" y sobres de compost y semillas. Adecuación del punto de venta en la matera histórica.</w:t>
             </w:r>
           </w:p>
         </w:tc>
@@ -2066,9 +2127,9 @@
                 <w:sz w:val="16"/>
                 <w:szCs w:val="16"/>
               </w:rPr>
-              <w:t xml:space="preserve">• Boceto final de libreta del Pequeño Cuidador
+              <w:t xml:space="preserve">• Boceto final de la libreta del Pequeño Cuidador
 • Cotización de tirada de 100 kits con pin
-• Layout del rincón de venta en la matera</w:t>
+• Layout del rincón de venta en la matera histórica</w:t>
             </w:r>
           </w:p>
         </w:tc>
@@ -2179,7 +2240,7 @@
                 <w:sz w:val="18"/>
                 <w:szCs w:val="18"/>
               </w:rPr>
-              <w:t xml:space="preserve">Producción fotográfica 4K, catálogo digital y canal de reservas</w:t>
+              <w:t xml:space="preserve">Producción audiovisual 4K, tomas con dron y desarrollo web</w:t>
             </w:r>
           </w:p>
           <w:p>
@@ -2198,7 +2259,7 @@
                 <w:sz w:val="17"/>
                 <w:szCs w:val="17"/>
               </w:rPr>
-              <w:t xml:space="preserve">Sesión audiovisual profesional en El Pinar y corrales (interacción de niños con animales, cepillado y paseos). Maquetación del catálogo digital PDF y configuración de WhatsApp Business con catálogo de servicios y links de cobro.</w:t>
+              <w:t xml:space="preserve">Rodaje con equipo audiovisual del LAB y dron: coaching en El Pinar, niños con animales y relatos de Sol sobre su abuelo Toto Arrechea. Estructuración de la web transaccional y backend de turnos con Leandro Choi.</w:t>
             </w:r>
           </w:p>
         </w:tc>
@@ -2233,9 +2294,9 @@
                 <w:sz w:val="16"/>
                 <w:szCs w:val="16"/>
               </w:rPr>
-              <w:t xml:space="preserve">• Banco fotográfico de 30 tomas en alta resolución
-• Catálogo digital PDF listo para difusión
-• WhatsApp Business configurado con catálogo</w:t>
+              <w:t xml:space="preserve">• Banco de 30 fotos 4K y tomas con dron en El Pinar
+• Rodaje de 3 micro-píldoras testimoniales
+• Arquitectura de la web transaccional y backend</w:t>
             </w:r>
           </w:p>
         </w:tc>
@@ -2346,7 +2407,7 @@
                 <w:sz w:val="18"/>
                 <w:szCs w:val="18"/>
               </w:rPr>
-              <w:t xml:space="preserve">Rueda comercial B2B con agencias de Esquel/Trevelin y sinergias de cohorte</w:t>
+              <w:t xml:space="preserve">Rueda comercial B2B con agencias y articulación con Haiku</w:t>
             </w:r>
           </w:p>
           <w:p>
@@ -2365,7 +2426,7 @@
                 <w:sz w:val="17"/>
                 <w:szCs w:val="17"/>
               </w:rPr>
-              <w:t xml:space="preserve">Reunión de presentación con agencias receptivas de Esquel y Trevelin para comercializar paradas sobre Ruta 259. Coordinación de retiros holísticos combinados con Haiku Casa de Té y True Patagonia. Agenda de El Paseo del Pinar.</w:t>
+              <w:t xml:space="preserve">Reunión con agencias receptivas de Esquel y Trevelin para promocionar paradas turísticas sobre Ruta 259. Coordinación de retiros de té y bienestar en El Pinar junto a Haiku Casa de Té. Fecha de El Paseo del Pinar.</w:t>
             </w:r>
           </w:p>
         </w:tc>
@@ -2400,9 +2461,9 @@
                 <w:sz w:val="16"/>
                 <w:szCs w:val="16"/>
               </w:rPr>
-              <w:t xml:space="preserve">• Acuerdos de comercialización con 2 agencias
-• Alianza estratégica con Haiku / True Patagonia
-• Fecha confirmada para El Paseo del Pinar</w:t>
+              <w:t xml:space="preserve">• Acuerdos marco de derivación con 2 agencias
+• Alianza estratégica con Haiku (té en El Pinar)
+• Agenda confirmada para El Paseo del Pinar</w:t>
             </w:r>
           </w:p>
         </w:tc>
@@ -2513,7 +2574,7 @@
                 <w:sz w:val="18"/>
                 <w:szCs w:val="18"/>
               </w:rPr>
-              <w:t xml:space="preserve">Simulacro vivencial en campo (Fam Tour con informantes turísticos y guías)</w:t>
+              <w:t xml:space="preserve">Simulacro vivencial en campo (Fam Tour con informantes y guías)</w:t>
             </w:r>
           </w:p>
           <w:p>
@@ -2532,7 +2593,7 @@
                 <w:sz w:val="17"/>
                 <w:szCs w:val="17"/>
               </w:rPr>
-              <w:t xml:space="preserve">Salida piloto completa con 10 invitados (informantes de Esquel y Trevelin, guías y prestadores). Recorrido por granja, bautismo ecuestre en El Pinar, entrega simbólica del kit y merienda en la matera histórica. Registro de feedback.</w:t>
+              <w:t xml:space="preserve">Salida piloto con 10 invitados (informantes turísticos comarcales, guías y prestadores). Recorrido guiado por granja, bautismo ecuestre en El Pinar con prueba en pista, entrega del kit infantil y merienda en la matera.</w:t>
             </w:r>
           </w:p>
         </w:tc>
@@ -2568,8 +2629,8 @@
                 <w:szCs w:val="16"/>
               </w:rPr>
               <w:t xml:space="preserve">• Ejecución del Fam Tour con 10 participantes
-• Encuestas de satisfacción y ajuste de tiempos
-• Registro audiovisual de testimonios en campo</w:t>
+• Evaluación de tiempos, calidez y seguridad
+• Registro fotográfico y en video de la experiencia</w:t>
             </w:r>
           </w:p>
         </w:tc>
@@ -2699,7 +2760,7 @@
                 <w:sz w:val="17"/>
                 <w:szCs w:val="17"/>
               </w:rPr>
-              <w:t xml:space="preserve">Montaje del stand de Lucero en Melipal con exhibición de kits, semillas, fotos y folletería. Pitch de 3 minutos de María Soledad Arrechea ante operadores y prensa. Firma de convenios comerciales y entrega de hoja de ruta 2026/2027.</w:t>
+              <w:t xml:space="preserve">Stand interactivo en Melipal con exhibición del Kit del Pequeño Cuidador, fotos 4K y productos de granja. Pitch de 3 minutos de María Soledad Arrechea. Presentación de la web y firma de acuerdos comerciales post-incubación.</w:t>
             </w:r>
           </w:p>
         </w:tc>
@@ -2734,9 +2795,9 @@
                 <w:sz w:val="16"/>
                 <w:szCs w:val="16"/>
               </w:rPr>
-              <w:t xml:space="preserve">• Stand temático con kits y productos de granja
+              <w:t xml:space="preserve">• Stand temático interactivo montado en Melipal
 • Pitch institucional expuesto ante prensa y sector
-• Firma de cartas de intención comercial</w:t>
+• Firma de cartas de acuerdo comercial 2026/27</w:t>
             </w:r>
           </w:p>
         </w:tc>
@@ -2780,7 +2841,7 @@
           <w:sz w:val="21"/>
           <w:szCs w:val="21"/>
         </w:rPr>
-        <w:t xml:space="preserve">El presente plan representa un pacto operativo para potenciar un espacio que combina el rigor de la biología, la etología ecuestre y la vocación docente con el calor de una comunidad que abraza a los animales y a las familias. María Soledad Arrechea liderará las experiencias y la formación etológica, mientras que el equipo técnico de Esquel LAB acompañará en la ingeniería de costos, el diseño editorial del kit infantil y la apertura de canales comerciales con el sector turístico formal.</w:t>
+        <w:t xml:space="preserve">El presente plan representa un pacto operativo y ético para potenciar un espacio que combina el rigor de la biología, la etología ecuestre y la vocación docente con el calor de una comunidad que abraza a los animales y a las familias. María Soledad Arrechea liderará las experiencias y la formación etológica, mientras que el equipo técnico de Esquel LAB asume el compromiso del desarrollo de la plataforma web transaccional, el rodaje audiovisual profesional y la apertura de canales comerciales formales.</w:t>
       </w:r>
     </w:p>
     <w:p>
@@ -2799,7 +2860,7 @@
           <w:sz w:val="21"/>
           <w:szCs w:val="21"/>
         </w:rPr>
-        <w:t xml:space="preserve">Con la firma de este acuerdo, el Centro Integral Ecuestre Lucero se consolida como un faro de turismo inclusivo, regenerativo y consciente para toda la Patagonia.</w:t>
+        <w:t xml:space="preserve">Con la firma de este acuerdo, el Centro Integral Ecuestre Lucero se consolida como un estandarte de turismo inclusivo, regenerativo y consciente para toda la Patagonia.</w:t>
       </w:r>
     </w:p>
     <w:p>

</xml_diff>